<commit_message>
DWÓJKA: equal SET 1/2/3 columns + graphics span full table height
DWÓJKA_Bo3.docx (binary patch on word/document.xml):
- Punkty SET 1/2/3 columns were unequal (tcW 991 / 1035 / 1173), so SET 3
  rendered visibly wider than SET 1/2. Patched tblGrid (grid[7] 675→631,
  grid[9] 810→628; saved 226 dxa pushed to grid[10] for Wygrane sety)
  and the per-cell tcW in r2/r3/r4 so c1=c2=c3=991 and c4 (Wygrane sety) =
  1591. Also merged the SET 3 text from two runs ('SET ' + '3') into one
  ('SET 3') to match SET 1/2 single-run style.

TROJKA_AREA_HEIGHT_CM 15.0 → 17.5. With 4-5 graphics the lower ones
stopped around row 14 instead of reaching PKT. The old 18.5 was rejected
because of HTML preview overflow:hidden clipping, not the real DOCX —
which renders fine at 17.5 and now fills the full table column height.
Applies to DWÓJKA Grupa and TRÓJKA Grupa (CZWORKA strip is separate,
IND uses its own geometry).
</commit_message>
<xml_diff>
--- a/DWÓJKA_Bo3.docx
+++ b/DWÓJKA_Bo3.docx
@@ -23,10 +23,10 @@
         <w:gridCol w:w="361"/>
         <w:gridCol w:w="630"/>
         <w:gridCol w:w="360"/>
-        <w:gridCol w:w="675"/>
+        <w:gridCol w:w="631"/>
         <w:gridCol w:w="363"/>
-        <w:gridCol w:w="810"/>
-        <w:gridCol w:w="355"/>
+        <w:gridCol w:w="628"/>
+        <w:gridCol w:w="581"/>
         <w:gridCol w:w="959"/>
         <w:gridCol w:w="51"/>
         <w:gridCol w:w="1890"/>
@@ -600,7 +600,7 @@
         </w:tc>
         <w:tc>
           <w:tcPr>
-            <w:tcW w:w="1035" w:type="dxa"/>
+            <w:tcW w:w="991" w:type="dxa"/>
             <w:gridSpan w:val="2"/>
             <w:tcBorders>
               <w:top w:val="single" w:sz="4" w:space="0" w:color="auto"/>
@@ -644,7 +644,7 @@
         </w:tc>
         <w:tc>
           <w:tcPr>
-            <w:tcW w:w="1173" w:type="dxa"/>
+            <w:tcW w:w="991" w:type="dxa"/>
             <w:gridSpan w:val="2"/>
             <w:tcBorders>
               <w:top w:val="single" w:sz="4" w:space="0" w:color="auto"/>
@@ -679,21 +679,13 @@
                 <w:b/>
                 <w:bCs/>
               </w:rPr>
-              <w:t xml:space="preserve">SET </w:t>
+              <w:t>SET 3</w:t>
             </w:r>
-            <w:r>
-              <w:rPr>
-                <w:rFonts w:ascii="Aptos" w:eastAsia="Aptos" w:hAnsi="Aptos" w:cs="Aptos"/>
-                <w:b/>
-                <w:bCs/>
-              </w:rPr>
-              <w:t>3</w:t>
-            </w:r>
-          </w:p>
-        </w:tc>
-        <w:tc>
-          <w:tcPr>
-            <w:tcW w:w="1365" w:type="dxa"/>
+          </w:p>
+        </w:tc>
+        <w:tc>
+          <w:tcPr>
+            <w:tcW w:w="1591" w:type="dxa"/>
             <w:gridSpan w:val="3"/>
             <w:tcBorders>
               <w:top w:val="single" w:sz="4" w:space="0" w:color="auto"/>
@@ -824,7 +816,7 @@
         </w:tc>
         <w:tc>
           <w:tcPr>
-            <w:tcW w:w="1035" w:type="dxa"/>
+            <w:tcW w:w="991" w:type="dxa"/>
             <w:gridSpan w:val="2"/>
             <w:tcBorders>
               <w:top w:val="single" w:sz="4" w:space="0" w:color="auto"/>
@@ -847,7 +839,7 @@
         </w:tc>
         <w:tc>
           <w:tcPr>
-            <w:tcW w:w="1173" w:type="dxa"/>
+            <w:tcW w:w="991" w:type="dxa"/>
             <w:gridSpan w:val="2"/>
             <w:tcBorders>
               <w:top w:val="single" w:sz="4" w:space="0" w:color="auto"/>
@@ -866,7 +858,7 @@
         </w:tc>
         <w:tc>
           <w:tcPr>
-            <w:tcW w:w="1365" w:type="dxa"/>
+            <w:tcW w:w="1591" w:type="dxa"/>
             <w:gridSpan w:val="3"/>
             <w:tcBorders>
               <w:top w:val="single" w:sz="4" w:space="0" w:color="auto"/>
@@ -966,7 +958,7 @@
         </w:tc>
         <w:tc>
           <w:tcPr>
-            <w:tcW w:w="1035" w:type="dxa"/>
+            <w:tcW w:w="991" w:type="dxa"/>
             <w:gridSpan w:val="2"/>
             <w:tcBorders>
               <w:top w:val="single" w:sz="4" w:space="0" w:color="auto"/>
@@ -989,7 +981,7 @@
         </w:tc>
         <w:tc>
           <w:tcPr>
-            <w:tcW w:w="1173" w:type="dxa"/>
+            <w:tcW w:w="991" w:type="dxa"/>
             <w:gridSpan w:val="2"/>
             <w:tcBorders>
               <w:top w:val="single" w:sz="4" w:space="0" w:color="auto"/>
@@ -1008,7 +1000,7 @@
         </w:tc>
         <w:tc>
           <w:tcPr>
-            <w:tcW w:w="1365" w:type="dxa"/>
+            <w:tcW w:w="1591" w:type="dxa"/>
             <w:gridSpan w:val="3"/>
             <w:tcBorders>
               <w:top w:val="single" w:sz="4" w:space="0" w:color="auto"/>

</xml_diff>